<commit_message>
feat: Aula 01 - Completa
</commit_message>
<xml_diff>
--- a/Aula 01 - Propósitos da modelagem/Propósitos da modelagem - Conceito De Modelos.docx
+++ b/Aula 01 - Propósitos da modelagem/Propósitos da modelagem - Conceito De Modelos.docx
@@ -40,6 +40,7 @@
     <w:p>
       <w:pPr>
         <w:pStyle w:val="PargrafodaLista"/>
+        <w:ind w:firstLine="696"/>
       </w:pPr>
       <w:r>
         <w:t>Diagrama de Classe, DER e Protótipo de software.</w:t>
@@ -71,37 +72,37 @@
     <w:p>
       <w:pPr>
         <w:pStyle w:val="PargrafodaLista"/>
-        <w:ind w:left="1416"/>
+        <w:ind w:firstLine="696"/>
+        <w:rPr>
+          <w:b/>
+          <w:bCs/>
+        </w:rPr>
+      </w:pPr>
+      <w:r>
         <w:rPr>
           <w:rStyle w:val="Forte"/>
+          <w:b w:val="0"/>
+          <w:bCs w:val="0"/>
         </w:rPr>
-      </w:pPr>
-    </w:p>
-    <w:p>
-      <w:pPr>
-        <w:pStyle w:val="PargrafodaLista"/>
-        <w:ind w:firstLine="696"/>
-      </w:pPr>
+        <w:t xml:space="preserve">Os modelos são produções desenvolvidas antes do </w:t>
+      </w:r>
+      <w:proofErr w:type="gramStart"/>
       <w:r>
-        <w:t>Diagrama de Classe: Orientar o desenvolvedor quanto aos atributos e métodos das classes, bem como ter conhecimento a respeito do relacionamento entre elas.</w:t>
+        <w:rPr>
+          <w:rStyle w:val="Forte"/>
+          <w:b w:val="0"/>
+          <w:bCs w:val="0"/>
+        </w:rPr>
+        <w:t>produto final</w:t>
       </w:r>
-    </w:p>
-    <w:p>
-      <w:pPr>
-        <w:pStyle w:val="PargrafodaLista"/>
-        <w:ind w:firstLine="696"/>
-      </w:pPr>
+      <w:proofErr w:type="gramEnd"/>
       <w:r>
-        <w:t>DER: O Diagrama entidade relacionamento auxilia na visão da estrutura do banco de dados.</w:t>
-      </w:r>
-    </w:p>
-    <w:p>
-      <w:pPr>
-        <w:pStyle w:val="PargrafodaLista"/>
-        <w:ind w:firstLine="696"/>
-      </w:pPr>
-      <w:r>
-        <w:t>Protótipo de software: Um modelo base do software para realizar validações.</w:t>
+        <w:rPr>
+          <w:rStyle w:val="Forte"/>
+          <w:b w:val="0"/>
+          <w:bCs w:val="0"/>
+        </w:rPr>
+        <w:t>, a ideia é que seja mais simples, de fácil compreensão, e padronizado, é útil para auxiliar no planejamento de produtos, principalmente os mais complexos, também servindo como uma espécie de documentação, facilitando o estudo do projeto em questão.</w:t>
       </w:r>
     </w:p>
     <w:p>
@@ -131,6 +132,25 @@
       <w:pPr>
         <w:pStyle w:val="PargrafodaLista"/>
       </w:pPr>
+      <w:r>
+        <w:t>Simplificação;</w:t>
+      </w:r>
+    </w:p>
+    <w:p>
+      <w:pPr>
+        <w:pStyle w:val="PargrafodaLista"/>
+      </w:pPr>
+      <w:r>
+        <w:t>Padronização;</w:t>
+      </w:r>
+    </w:p>
+    <w:p>
+      <w:pPr>
+        <w:pStyle w:val="PargrafodaLista"/>
+      </w:pPr>
+      <w:r>
+        <w:t>Analogia.</w:t>
+      </w:r>
     </w:p>
     <w:sectPr>
       <w:pgSz w:w="11906" w:h="16838"/>

</xml_diff>